<commit_message>
JORS checklist final pass; package rebuilt as 2026-09-02 zip
argus order green on the rebuilt docx; reference list hash-identical to the gated 08-25
build so the metadata gate carries. Remaining items are the Zenodo DOI and the portal
upload.
</commit_message>
<xml_diff>
--- a/paper/SUBMISSION_CHECKLIST.docx
+++ b/paper/SUBMISSION_CHECKLIST.docx
@@ -2,7 +2,7 @@
 <file path=word/document.xml><?xml version="1.0" encoding="utf-8"?>
 <w:document xmlns:w="http://schemas.openxmlformats.org/wordprocessingml/2006/main" xmlns:m="http://schemas.openxmlformats.org/officeDocument/2006/math" xmlns:r="http://schemas.openxmlformats.org/officeDocument/2006/relationships" xmlns:o="urn:schemas-microsoft-com:office:office" xmlns:v="urn:schemas-microsoft-com:vml" xmlns:w10="urn:schemas-microsoft-com:office:word" xmlns:a="http://schemas.openxmlformats.org/drawingml/2006/main" xmlns:pic="http://schemas.openxmlformats.org/drawingml/2006/picture" xmlns:wp="http://schemas.openxmlformats.org/drawingml/2006/wordprocessingDrawing">
   <w:body>
-    <w:bookmarkStart w:id="13" w:name="X60b781f7bb818b2fc53a92ebfd922bb1a83c530"/>
+    <w:bookmarkStart w:id="16" w:name="X60b781f7bb818b2fc53a92ebfd922bb1a83c530"/>
     <w:p>
       <w:pPr>
         <w:pStyle w:val="Heading1"/>
@@ -16,6 +16,243 @@
         <w:pStyle w:val="FirstParagraph"/>
       </w:pPr>
       <w:r>
+        <w:t xml:space="preserve">Updated 2026-09-02 (final pass). Manuscript updated to release v0.2.0, cover letter rebuilt</w:t>
+      </w:r>
+      <w:r>
+        <w:t xml:space="preserve"> </w:t>
+      </w:r>
+      <w:r>
+        <w:t xml:space="preserve">on the Odinzen letterhead, gates re-run. Ready for the two submission clicks below.</w:t>
+      </w:r>
+    </w:p>
+    <w:bookmarkStart w:id="9" w:name="done-2026-09-02-third-pass"/>
+    <w:p>
+      <w:pPr>
+        <w:pStyle w:val="Heading2"/>
+      </w:pPr>
+      <w:r>
+        <w:t xml:space="preserve">Done (2026-09-02, third pass)</w:t>
+      </w:r>
+    </w:p>
+    <w:p>
+      <w:pPr>
+        <w:pStyle w:val="Compact"/>
+        <w:numPr>
+          <w:ilvl w:val="0"/>
+          <w:numId w:val="1001"/>
+        </w:numPr>
+      </w:pPr>
+      <w:r>
+        <w:t xml:space="preserve">main pushed (public repo now matches the deployed site) and release v0.2.0 tagged and pushed.</w:t>
+      </w:r>
+    </w:p>
+    <w:p>
+      <w:pPr>
+        <w:pStyle w:val="Compact"/>
+        <w:numPr>
+          <w:ilvl w:val="0"/>
+          <w:numId w:val="1001"/>
+        </w:numPr>
+      </w:pPr>
+      <w:r>
+        <w:t xml:space="preserve">Manuscript updated to v0.2.0: browser-application section lists all five tools including</w:t>
+      </w:r>
+      <w:r>
+        <w:t xml:space="preserve"> </w:t>
+      </w:r>
+      <w:r>
+        <w:t xml:space="preserve">session uploads and the live solver for any loaded three-cation file; the reuse section</w:t>
+      </w:r>
+      <w:r>
+        <w:t xml:space="preserve"> </w:t>
+      </w:r>
+      <w:r>
+        <w:t xml:space="preserve">records the in-browser hull covering loaded ternaries (was future work, now shipped);</w:t>
+      </w:r>
+      <w:r>
+        <w:t xml:space="preserve"> </w:t>
+      </w:r>
+      <w:r>
+        <w:t xml:space="preserve">software-location and data-availability blocks bumped; docx and PDF rebuilt from the md.</w:t>
+      </w:r>
+    </w:p>
+    <w:p>
+      <w:pPr>
+        <w:pStyle w:val="Compact"/>
+        <w:numPr>
+          <w:ilvl w:val="0"/>
+          <w:numId w:val="1001"/>
+        </w:numPr>
+      </w:pPr>
+      <w:r>
+        <w:t xml:space="preserve">Cover letter rebuilt on the Odinzen letterhead template (header block, footer logo),</w:t>
+      </w:r>
+      <w:r>
+        <w:t xml:space="preserve"> </w:t>
+      </w:r>
+      <w:r>
+        <w:t xml:space="preserve">dated 2 September 2026, v0.2.0 archive line; PDF rendered and visually checked.</w:t>
+      </w:r>
+    </w:p>
+    <w:p>
+      <w:pPr>
+        <w:pStyle w:val="Compact"/>
+        <w:numPr>
+          <w:ilvl w:val="0"/>
+          <w:numId w:val="1001"/>
+        </w:numPr>
+      </w:pPr>
+      <w:r>
+        <w:t xml:space="preserve">Gate record: argus order on the rebuilt docx is green (26 in-text / 26 list in</w:t>
+      </w:r>
+      <w:r>
+        <w:t xml:space="preserve"> </w:t>
+      </w:r>
+      <w:r>
+        <w:t xml:space="preserve">first-appearance order; tables 1-2 and figures 1-3 resolve). The reference list is</w:t>
+      </w:r>
+      <w:r>
+        <w:t xml:space="preserve"> </w:t>
+      </w:r>
+      <w:r>
+        <w:t xml:space="preserve">hash-identical to the 2026-08-25 build (sha256 prefix 9bac98bda6192e47), so the 08-25</w:t>
+      </w:r>
+      <w:r>
+        <w:t xml:space="preserve"> </w:t>
+      </w:r>
+      <w:r>
+        <w:t xml:space="preserve">metadata gate (24 registry-resolved, 2 hand-verified monographs, suspects adjudicated)</w:t>
+      </w:r>
+      <w:r>
+        <w:t xml:space="preserve"> </w:t>
+      </w:r>
+      <w:r>
+        <w:t xml:space="preserve">carries to this build unchanged.</w:t>
+      </w:r>
+    </w:p>
+    <w:bookmarkEnd w:id="9"/>
+    <w:bookmarkStart w:id="10" w:name="remaining---michaels-two-clicks"/>
+    <w:p>
+      <w:pPr>
+        <w:pStyle w:val="Heading2"/>
+      </w:pPr>
+      <w:r>
+        <w:t xml:space="preserve">Remaining - Michael’s two clicks</w:t>
+      </w:r>
+    </w:p>
+    <w:p>
+      <w:pPr>
+        <w:pStyle w:val="Compact"/>
+        <w:numPr>
+          <w:ilvl w:val="0"/>
+          <w:numId w:val="1002"/>
+        </w:numPr>
+      </w:pPr>
+      <w:r>
+        <w:rPr>
+          <w:b/>
+          <w:bCs/>
+        </w:rPr>
+        <w:t xml:space="preserve">Zenodo DOI (do first; JORS wants a persistent archive):</w:t>
+      </w:r>
+      <w:r>
+        <w:t xml:space="preserve"> </w:t>
+      </w:r>
+      <w:r>
+        <w:t xml:space="preserve">zenodo.org -&gt; log in with</w:t>
+      </w:r>
+      <w:r>
+        <w:t xml:space="preserve"> </w:t>
+      </w:r>
+      <w:r>
+        <w:t xml:space="preserve">GitHub -&gt; enable the hephaestus-mqmqa-public repository toggle -&gt; on GitHub, the existing</w:t>
+      </w:r>
+      <w:r>
+        <w:t xml:space="preserve"> </w:t>
+      </w:r>
+      <w:r>
+        <w:t xml:space="preserve">v0.2.0 release triggers the deposit (or click</w:t>
+      </w:r>
+      <w:r>
+        <w:t xml:space="preserve"> </w:t>
+      </w:r>
+      <w:r>
+        <w:t xml:space="preserve">“create release”</w:t>
+      </w:r>
+      <w:r>
+        <w:t xml:space="preserve"> </w:t>
+      </w:r>
+      <w:r>
+        <w:t xml:space="preserve">again if needed). Copy the</w:t>
+      </w:r>
+      <w:r>
+        <w:t xml:space="preserve"> </w:t>
+      </w:r>
+      <w:r>
+        <w:t xml:space="preserve">minted DOI into the JORS form when asked.</w:t>
+      </w:r>
+    </w:p>
+    <w:p>
+      <w:pPr>
+        <w:pStyle w:val="Compact"/>
+        <w:numPr>
+          <w:ilvl w:val="0"/>
+          <w:numId w:val="1002"/>
+        </w:numPr>
+      </w:pPr>
+      <w:r>
+        <w:rPr>
+          <w:b/>
+          <w:bCs/>
+        </w:rPr>
+        <w:t xml:space="preserve">JORS portal:</w:t>
+      </w:r>
+      <w:r>
+        <w:t xml:space="preserve"> </w:t>
+      </w:r>
+      <w:r>
+        <w:t xml:space="preserve">openresearchsoftware.metajnl.com -&gt; submit -&gt; upload the manuscript docx,</w:t>
+      </w:r>
+      <w:r>
+        <w:t xml:space="preserve"> </w:t>
+      </w:r>
+      <w:r>
+        <w:t xml:space="preserve">the three figures, and the cover letter from this package.</w:t>
+      </w:r>
+    </w:p>
+    <w:p>
+      <w:pPr>
+        <w:pStyle w:val="Compact"/>
+        <w:numPr>
+          <w:ilvl w:val="0"/>
+          <w:numId w:val="1002"/>
+        </w:numPr>
+      </w:pPr>
+      <w:r>
+        <w:t xml:space="preserve">Optional, after submission: SSRN (MatSciRN) preprint from the same PDF, feeding the</w:t>
+      </w:r>
+      <w:r>
+        <w:t xml:space="preserve"> </w:t>
+      </w:r>
+      <w:r>
+        <w:t xml:space="preserve">LinkedIn series.</w:t>
+      </w:r>
+    </w:p>
+    <w:bookmarkEnd w:id="10"/>
+    <w:bookmarkStart w:id="11" w:name="prior-passes"/>
+    <w:p>
+      <w:pPr>
+        <w:pStyle w:val="Heading2"/>
+      </w:pPr>
+      <w:r>
+        <w:t xml:space="preserve">Prior passes</w:t>
+      </w:r>
+    </w:p>
+    <w:p>
+      <w:pPr>
+        <w:pStyle w:val="FirstParagraph"/>
+      </w:pPr>
+      <w:r>
         <w:t xml:space="preserve">Updated 2026-08-25 (second pass). The bibliography is now Zotero-generated, the</w:t>
       </w:r>
       <w:r>
@@ -25,7 +262,8 @@
         <w:t xml:space="preserve">repository is public, and v0.1.0 is tagged. The list below is what remains.</w:t>
       </w:r>
     </w:p>
-    <w:bookmarkStart w:id="9" w:name="done-2026-08-25"/>
+    <w:bookmarkEnd w:id="11"/>
+    <w:bookmarkStart w:id="12" w:name="done-2026-08-25"/>
     <w:p>
       <w:pPr>
         <w:pStyle w:val="Heading2"/>
@@ -39,7 +277,7 @@
         <w:pStyle w:val="Compact"/>
         <w:numPr>
           <w:ilvl w:val="0"/>
-          <w:numId w:val="1001"/>
+          <w:numId w:val="1003"/>
         </w:numPr>
       </w:pPr>
       <w:r>
@@ -51,7 +289,7 @@
         <w:pStyle w:val="Compact"/>
         <w:numPr>
           <w:ilvl w:val="0"/>
-          <w:numId w:val="1001"/>
+          <w:numId w:val="1003"/>
         </w:numPr>
       </w:pPr>
       <w:r>
@@ -63,7 +301,7 @@
         <w:pStyle w:val="Compact"/>
         <w:numPr>
           <w:ilvl w:val="0"/>
-          <w:numId w:val="1001"/>
+          <w:numId w:val="1003"/>
         </w:numPr>
       </w:pPr>
       <w:r>
@@ -87,7 +325,7 @@
         <w:pStyle w:val="Compact"/>
         <w:numPr>
           <w:ilvl w:val="0"/>
-          <w:numId w:val="1001"/>
+          <w:numId w:val="1003"/>
         </w:numPr>
       </w:pPr>
       <w:r>
@@ -129,7 +367,7 @@
         <w:pStyle w:val="Compact"/>
         <w:numPr>
           <w:ilvl w:val="0"/>
-          <w:numId w:val="1001"/>
+          <w:numId w:val="1003"/>
         </w:numPr>
       </w:pPr>
       <w:r>
@@ -142,8 +380,8 @@
         <w:t xml:space="preserve">release v0.1.0.</w:t>
       </w:r>
     </w:p>
-    <w:bookmarkEnd w:id="9"/>
-    <w:bookmarkStart w:id="10" w:name="remaining-before-submission"/>
+    <w:bookmarkEnd w:id="12"/>
+    <w:bookmarkStart w:id="13" w:name="remaining-before-submission"/>
     <w:p>
       <w:pPr>
         <w:pStyle w:val="Heading2"/>
@@ -157,7 +395,7 @@
         <w:pStyle w:val="Compact"/>
         <w:numPr>
           <w:ilvl w:val="0"/>
-          <w:numId w:val="1002"/>
+          <w:numId w:val="1004"/>
         </w:numPr>
       </w:pPr>
       <w:r>
@@ -212,7 +450,7 @@
         <w:pStyle w:val="Compact"/>
         <w:numPr>
           <w:ilvl w:val="0"/>
-          <w:numId w:val="1002"/>
+          <w:numId w:val="1004"/>
         </w:numPr>
       </w:pPr>
       <w:r>
@@ -240,7 +478,7 @@
         <w:pStyle w:val="Compact"/>
         <w:numPr>
           <w:ilvl w:val="0"/>
-          <w:numId w:val="1002"/>
+          <w:numId w:val="1004"/>
         </w:numPr>
       </w:pPr>
       <w:r>
@@ -280,7 +518,7 @@
         <w:pStyle w:val="Compact"/>
         <w:numPr>
           <w:ilvl w:val="0"/>
-          <w:numId w:val="1002"/>
+          <w:numId w:val="1004"/>
         </w:numPr>
       </w:pPr>
       <w:r>
@@ -297,8 +535,8 @@
         <w:t xml:space="preserve">if submission is not on 2026-08-25.</w:t>
       </w:r>
     </w:p>
-    <w:bookmarkEnd w:id="10"/>
-    <w:bookmarkStart w:id="11" w:name="X0b0de9608375c0b510d028c84fe6ac621772307"/>
+    <w:bookmarkEnd w:id="13"/>
+    <w:bookmarkStart w:id="14" w:name="X0b0de9608375c0b510d028c84fe6ac621772307"/>
     <w:p>
       <w:pPr>
         <w:pStyle w:val="Heading2"/>
@@ -312,7 +550,7 @@
         <w:pStyle w:val="Compact"/>
         <w:numPr>
           <w:ilvl w:val="0"/>
-          <w:numId w:val="1003"/>
+          <w:numId w:val="1005"/>
         </w:numPr>
       </w:pPr>
       <w:r>
@@ -342,7 +580,7 @@
         <w:pStyle w:val="Compact"/>
         <w:numPr>
           <w:ilvl w:val="0"/>
-          <w:numId w:val="1003"/>
+          <w:numId w:val="1005"/>
         </w:numPr>
       </w:pPr>
       <w:r>
@@ -354,7 +592,7 @@
         <w:pStyle w:val="Compact"/>
         <w:numPr>
           <w:ilvl w:val="0"/>
-          <w:numId w:val="1003"/>
+          <w:numId w:val="1005"/>
         </w:numPr>
       </w:pPr>
       <w:r>
@@ -366,7 +604,7 @@
         <w:pStyle w:val="Compact"/>
         <w:numPr>
           <w:ilvl w:val="0"/>
-          <w:numId w:val="1003"/>
+          <w:numId w:val="1005"/>
         </w:numPr>
       </w:pPr>
       <w:r>
@@ -378,7 +616,7 @@
         <w:pStyle w:val="Compact"/>
         <w:numPr>
           <w:ilvl w:val="0"/>
-          <w:numId w:val="1003"/>
+          <w:numId w:val="1005"/>
         </w:numPr>
       </w:pPr>
       <w:r>
@@ -390,7 +628,7 @@
         <w:pStyle w:val="Compact"/>
         <w:numPr>
           <w:ilvl w:val="0"/>
-          <w:numId w:val="1003"/>
+          <w:numId w:val="1005"/>
         </w:numPr>
       </w:pPr>
       <w:r>
@@ -402,7 +640,7 @@
         <w:pStyle w:val="Compact"/>
         <w:numPr>
           <w:ilvl w:val="0"/>
-          <w:numId w:val="1003"/>
+          <w:numId w:val="1005"/>
         </w:numPr>
       </w:pPr>
       <w:r>
@@ -415,8 +653,8 @@
         <w:t xml:space="preserve">black, Odinzen-only byline, references render correctly.</w:t>
       </w:r>
     </w:p>
-    <w:bookmarkEnd w:id="11"/>
-    <w:bookmarkStart w:id="12" w:name="notes"/>
+    <w:bookmarkEnd w:id="14"/>
+    <w:bookmarkStart w:id="15" w:name="notes"/>
     <w:p>
       <w:pPr>
         <w:pStyle w:val="Heading2"/>
@@ -430,7 +668,7 @@
         <w:pStyle w:val="Compact"/>
         <w:numPr>
           <w:ilvl w:val="0"/>
-          <w:numId w:val="1004"/>
+          <w:numId w:val="1006"/>
         </w:numPr>
       </w:pPr>
       <w:r>
@@ -448,7 +686,7 @@
         <w:pStyle w:val="Compact"/>
         <w:numPr>
           <w:ilvl w:val="0"/>
-          <w:numId w:val="1004"/>
+          <w:numId w:val="1006"/>
         </w:numPr>
       </w:pPr>
       <w:r>
@@ -460,7 +698,7 @@
         <w:pStyle w:val="Compact"/>
         <w:numPr>
           <w:ilvl w:val="0"/>
-          <w:numId w:val="1004"/>
+          <w:numId w:val="1006"/>
         </w:numPr>
       </w:pPr>
       <w:r>
@@ -473,8 +711,8 @@
         <w:t xml:space="preserve">added in revision if reviewers ask.</w:t>
       </w:r>
     </w:p>
-    <w:bookmarkEnd w:id="12"/>
-    <w:bookmarkEnd w:id="13"/>
+    <w:bookmarkEnd w:id="15"/>
+    <w:bookmarkEnd w:id="16"/>
     <w:sectPr>
       <w:footnotePr>
         <w:numRestart w:val="eachSect"/>
@@ -813,6 +1051,39 @@
     <w:abstractNumId w:val="991"/>
   </w:num>
   <w:num w:numId="1004">
+    <w:abstractNumId w:val="99411"/>
+    <w:lvlOverride w:ilvl="0">
+      <w:startOverride w:val="1"/>
+    </w:lvlOverride>
+    <w:lvlOverride w:ilvl="1">
+      <w:startOverride w:val="1"/>
+    </w:lvlOverride>
+    <w:lvlOverride w:ilvl="2">
+      <w:startOverride w:val="1"/>
+    </w:lvlOverride>
+    <w:lvlOverride w:ilvl="3">
+      <w:startOverride w:val="1"/>
+    </w:lvlOverride>
+    <w:lvlOverride w:ilvl="4">
+      <w:startOverride w:val="1"/>
+    </w:lvlOverride>
+    <w:lvlOverride w:ilvl="5">
+      <w:startOverride w:val="1"/>
+    </w:lvlOverride>
+    <w:lvlOverride w:ilvl="6">
+      <w:startOverride w:val="1"/>
+    </w:lvlOverride>
+    <w:lvlOverride w:ilvl="7">
+      <w:startOverride w:val="1"/>
+    </w:lvlOverride>
+    <w:lvlOverride w:ilvl="8">
+      <w:startOverride w:val="1"/>
+    </w:lvlOverride>
+  </w:num>
+  <w:num w:numId="1005">
+    <w:abstractNumId w:val="991"/>
+  </w:num>
+  <w:num w:numId="1006">
     <w:abstractNumId w:val="991"/>
   </w:num>
 </w:numbering>
@@ -839,13 +1110,6 @@
   <w:style w:default="1" w:styleId="Normal" w:type="paragraph">
     <w:name w:val="Normal"/>
     <w:qFormat/>
-    <w:pPr>
-      <w:jc w:val="both"/>
-    </w:pPr>
-    <w:rPr>
-      <w:rFonts w:ascii="Times New Roman" w:cs="Times New Roman" w:hAnsi="Times New Roman"/>
-      <w:color w:val="000000"/>
-    </w:rPr>
   </w:style>
   <w:style w:styleId="BodyText" w:type="paragraph">
     <w:name w:val="Body Text"/>
@@ -929,7 +1193,7 @@
     <w:rsid w:val="00A10FD9"/>
     <w:rPr>
       <w:rFonts w:cstheme="majorBidi" w:eastAsiaTheme="majorEastAsia"/>
-      <w:color w:val="000000"/>
+      <w:color w:themeColor="text1" w:themeTint="A6" w:val="595959"/>
       <w:spacing w:val="15"/>
       <w:sz w:val="28"/>
       <w:szCs w:val="28"/>
@@ -1019,7 +1283,7 @@
     </w:pPr>
     <w:rPr>
       <w:rFonts w:asciiTheme="majorHAnsi" w:cstheme="majorBidi" w:eastAsiaTheme="majorEastAsia" w:hAnsiTheme="majorHAnsi"/>
-      <w:color w:val="000000"/>
+      <w:color w:themeColor="accent1" w:themeShade="BF" w:val="0F4761"/>
       <w:sz w:val="40"/>
       <w:szCs w:val="40"/>
     </w:rPr>
@@ -1042,7 +1306,7 @@
     </w:pPr>
     <w:rPr>
       <w:rFonts w:asciiTheme="majorHAnsi" w:cstheme="majorBidi" w:eastAsiaTheme="majorEastAsia" w:hAnsiTheme="majorHAnsi"/>
-      <w:color w:val="000000"/>
+      <w:color w:themeColor="accent1" w:themeShade="BF" w:val="0F4761"/>
       <w:sz w:val="32"/>
       <w:szCs w:val="32"/>
     </w:rPr>
@@ -1065,7 +1329,7 @@
     </w:pPr>
     <w:rPr>
       <w:rFonts w:cstheme="majorBidi" w:eastAsiaTheme="majorEastAsia"/>
-      <w:color w:val="000000"/>
+      <w:color w:themeColor="accent1" w:themeShade="BF" w:val="0F4761"/>
       <w:sz w:val="28"/>
       <w:szCs w:val="28"/>
     </w:rPr>
@@ -1090,7 +1354,7 @@
       <w:rFonts w:cstheme="majorBidi" w:eastAsiaTheme="majorEastAsia"/>
       <w:i/>
       <w:iCs/>
-      <w:color w:val="000000"/>
+      <w:color w:themeColor="accent1" w:themeShade="BF" w:val="0F4761"/>
     </w:rPr>
   </w:style>
   <w:style w:styleId="Heading5" w:type="paragraph">
@@ -1111,7 +1375,7 @@
     </w:pPr>
     <w:rPr>
       <w:rFonts w:cstheme="majorBidi" w:eastAsiaTheme="majorEastAsia"/>
-      <w:color w:val="000000"/>
+      <w:color w:themeColor="accent1" w:themeShade="BF" w:val="0F4761"/>
     </w:rPr>
   </w:style>
   <w:style w:styleId="Heading6" w:type="paragraph">
@@ -1134,7 +1398,7 @@
       <w:rFonts w:cstheme="majorBidi" w:eastAsiaTheme="majorEastAsia"/>
       <w:i/>
       <w:iCs/>
-      <w:color w:val="000000"/>
+      <w:color w:themeColor="text1" w:themeTint="A6" w:val="595959"/>
     </w:rPr>
   </w:style>
   <w:style w:styleId="Heading7" w:type="paragraph">
@@ -1155,7 +1419,7 @@
     </w:pPr>
     <w:rPr>
       <w:rFonts w:cstheme="majorBidi" w:eastAsiaTheme="majorEastAsia"/>
-      <w:color w:val="000000"/>
+      <w:color w:themeColor="text1" w:themeTint="A6" w:val="595959"/>
     </w:rPr>
   </w:style>
   <w:style w:styleId="Heading8" w:type="paragraph">
@@ -1178,7 +1442,7 @@
       <w:rFonts w:cstheme="majorBidi" w:eastAsiaTheme="majorEastAsia"/>
       <w:i/>
       <w:iCs/>
-      <w:color w:val="000000"/>
+      <w:color w:themeColor="text1" w:themeTint="D8" w:val="272727"/>
     </w:rPr>
   </w:style>
   <w:style w:styleId="Heading9" w:type="paragraph">
@@ -1199,7 +1463,7 @@
     </w:pPr>
     <w:rPr>
       <w:rFonts w:cstheme="majorBidi" w:eastAsiaTheme="majorEastAsia"/>
-      <w:color w:val="000000"/>
+      <w:color w:themeColor="text1" w:themeTint="D8" w:val="272727"/>
     </w:rPr>
   </w:style>
   <w:style w:customStyle="1" w:styleId="Heading1Char" w:type="character">
@@ -1210,7 +1474,7 @@
     <w:rsid w:val="00A10FD9"/>
     <w:rPr>
       <w:rFonts w:asciiTheme="majorHAnsi" w:cstheme="majorBidi" w:eastAsiaTheme="majorEastAsia" w:hAnsiTheme="majorHAnsi"/>
-      <w:color w:val="000000"/>
+      <w:color w:themeColor="accent1" w:themeShade="BF" w:val="0F4761"/>
       <w:sz w:val="40"/>
       <w:szCs w:val="40"/>
     </w:rPr>
@@ -1224,7 +1488,7 @@
     <w:rsid w:val="00A10FD9"/>
     <w:rPr>
       <w:rFonts w:asciiTheme="majorHAnsi" w:cstheme="majorBidi" w:eastAsiaTheme="majorEastAsia" w:hAnsiTheme="majorHAnsi"/>
-      <w:color w:val="000000"/>
+      <w:color w:themeColor="accent1" w:themeShade="BF" w:val="0F4761"/>
       <w:sz w:val="32"/>
       <w:szCs w:val="32"/>
     </w:rPr>
@@ -1238,7 +1502,7 @@
     <w:rsid w:val="00A10FD9"/>
     <w:rPr>
       <w:rFonts w:cstheme="majorBidi" w:eastAsiaTheme="majorEastAsia"/>
-      <w:color w:val="000000"/>
+      <w:color w:themeColor="accent1" w:themeShade="BF" w:val="0F4761"/>
       <w:sz w:val="28"/>
       <w:szCs w:val="28"/>
     </w:rPr>
@@ -1254,7 +1518,7 @@
       <w:rFonts w:cstheme="majorBidi" w:eastAsiaTheme="majorEastAsia"/>
       <w:i/>
       <w:iCs/>
-      <w:color w:val="000000"/>
+      <w:color w:themeColor="accent1" w:themeShade="BF" w:val="0F4761"/>
     </w:rPr>
   </w:style>
   <w:style w:customStyle="1" w:styleId="Heading5Char" w:type="character">
@@ -1266,7 +1530,7 @@
     <w:rsid w:val="00A10FD9"/>
     <w:rPr>
       <w:rFonts w:cstheme="majorBidi" w:eastAsiaTheme="majorEastAsia"/>
-      <w:color w:val="000000"/>
+      <w:color w:themeColor="accent1" w:themeShade="BF" w:val="0F4761"/>
     </w:rPr>
   </w:style>
   <w:style w:customStyle="1" w:styleId="Heading6Char" w:type="character">
@@ -1280,7 +1544,7 @@
       <w:rFonts w:cstheme="majorBidi" w:eastAsiaTheme="majorEastAsia"/>
       <w:i/>
       <w:iCs/>
-      <w:color w:val="000000"/>
+      <w:color w:themeColor="text1" w:themeTint="A6" w:val="595959"/>
     </w:rPr>
   </w:style>
   <w:style w:customStyle="1" w:styleId="Heading7Char" w:type="character">
@@ -1292,7 +1556,7 @@
     <w:rsid w:val="00A10FD9"/>
     <w:rPr>
       <w:rFonts w:cstheme="majorBidi" w:eastAsiaTheme="majorEastAsia"/>
-      <w:color w:val="000000"/>
+      <w:color w:themeColor="text1" w:themeTint="A6" w:val="595959"/>
     </w:rPr>
   </w:style>
   <w:style w:customStyle="1" w:styleId="Heading8Char" w:type="character">
@@ -1306,7 +1570,7 @@
       <w:rFonts w:cstheme="majorBidi" w:eastAsiaTheme="majorEastAsia"/>
       <w:i/>
       <w:iCs/>
-      <w:color w:val="000000"/>
+      <w:color w:themeColor="text1" w:themeTint="D8" w:val="272727"/>
     </w:rPr>
   </w:style>
   <w:style w:customStyle="1" w:styleId="Heading9Char" w:type="character">
@@ -1318,7 +1582,7 @@
     <w:rsid w:val="00A10FD9"/>
     <w:rPr>
       <w:rFonts w:cstheme="majorBidi" w:eastAsiaTheme="majorEastAsia"/>
-      <w:color w:val="000000"/>
+      <w:color w:themeColor="text1" w:themeTint="D8" w:val="272727"/>
     </w:rPr>
   </w:style>
   <w:style w:styleId="BlockText" w:type="paragraph">
@@ -1460,7 +1724,7 @@
     <w:name w:val="Hyperlink"/>
     <w:basedOn w:val="BodyTextChar"/>
     <w:rPr>
-      <w:color w:val="000000"/>
+      <w:color w:themeColor="accent1" w:val="4F81BD"/>
     </w:rPr>
   </w:style>
   <w:style w:styleId="TOCHeading" w:type="paragraph">
@@ -1478,10 +1742,10 @@
       <w:rFonts w:asciiTheme="majorHAnsi" w:cstheme="majorBidi" w:eastAsiaTheme="majorEastAsia" w:hAnsiTheme="majorHAnsi"/>
       <w:b w:val="0"/>
       <w:bCs w:val="0"/>
-      <w:color w:val="000000"/>
-    </w:rPr>
-  </w:style>
-  <w:style w:customStyle="1" w:styleId="SourceCode" w:type="paragraph">
+      <w:color w:themeColor="accent1" w:themeShade="BF" w:val="365F91"/>
+    </w:rPr>
+  </w:style>
+  <w:style w:type="paragraph" w:customStyle="1" w:styleId="SourceCode">
     <w:name w:val="Source Code"/>
     <w:basedOn w:val="Normal"/>
     <w:link w:val="VerbatimChar"/>
@@ -1489,228 +1753,228 @@
       <w:wordWrap w:val="off"/>
     </w:pPr>
   </w:style>
-  <w:style w:customStyle="1" w:styleId="KeywordTok" w:type="character">
+  <w:style w:type="character" w:customStyle="1" w:styleId="KeywordTok">
     <w:name w:val="KeywordTok"/>
     <w:basedOn w:val="VerbatimChar"/>
     <w:rPr>
       <w:b/>
-      <w:color w:val="000000"/>
-    </w:rPr>
-  </w:style>
-  <w:style w:customStyle="1" w:styleId="DataTypeTok" w:type="character">
+      <w:color w:val="007020"/>
+    </w:rPr>
+  </w:style>
+  <w:style w:type="character" w:customStyle="1" w:styleId="DataTypeTok">
     <w:name w:val="DataTypeTok"/>
     <w:basedOn w:val="VerbatimChar"/>
     <w:rPr>
-      <w:color w:val="000000"/>
-    </w:rPr>
-  </w:style>
-  <w:style w:customStyle="1" w:styleId="DecValTok" w:type="character">
+      <w:color w:val="902000"/>
+    </w:rPr>
+  </w:style>
+  <w:style w:type="character" w:customStyle="1" w:styleId="DecValTok">
     <w:name w:val="DecValTok"/>
     <w:basedOn w:val="VerbatimChar"/>
     <w:rPr>
-      <w:color w:val="000000"/>
-    </w:rPr>
-  </w:style>
-  <w:style w:customStyle="1" w:styleId="BaseNTok" w:type="character">
+      <w:color w:val="40a070"/>
+    </w:rPr>
+  </w:style>
+  <w:style w:type="character" w:customStyle="1" w:styleId="BaseNTok">
     <w:name w:val="BaseNTok"/>
     <w:basedOn w:val="VerbatimChar"/>
     <w:rPr>
-      <w:color w:val="000000"/>
-    </w:rPr>
-  </w:style>
-  <w:style w:customStyle="1" w:styleId="FloatTok" w:type="character">
+      <w:color w:val="40a070"/>
+    </w:rPr>
+  </w:style>
+  <w:style w:type="character" w:customStyle="1" w:styleId="FloatTok">
     <w:name w:val="FloatTok"/>
     <w:basedOn w:val="VerbatimChar"/>
     <w:rPr>
-      <w:color w:val="000000"/>
-    </w:rPr>
-  </w:style>
-  <w:style w:customStyle="1" w:styleId="ConstantTok" w:type="character">
+      <w:color w:val="40a070"/>
+    </w:rPr>
+  </w:style>
+  <w:style w:type="character" w:customStyle="1" w:styleId="ConstantTok">
     <w:name w:val="ConstantTok"/>
     <w:basedOn w:val="VerbatimChar"/>
     <w:rPr>
-      <w:color w:val="000000"/>
-    </w:rPr>
-  </w:style>
-  <w:style w:customStyle="1" w:styleId="CharTok" w:type="character">
+      <w:color w:val="880000"/>
+    </w:rPr>
+  </w:style>
+  <w:style w:type="character" w:customStyle="1" w:styleId="CharTok">
     <w:name w:val="CharTok"/>
     <w:basedOn w:val="VerbatimChar"/>
     <w:rPr>
-      <w:color w:val="000000"/>
-    </w:rPr>
-  </w:style>
-  <w:style w:customStyle="1" w:styleId="SpecialCharTok" w:type="character">
+      <w:color w:val="4070a0"/>
+    </w:rPr>
+  </w:style>
+  <w:style w:type="character" w:customStyle="1" w:styleId="SpecialCharTok">
     <w:name w:val="SpecialCharTok"/>
     <w:basedOn w:val="VerbatimChar"/>
     <w:rPr>
-      <w:color w:val="000000"/>
-    </w:rPr>
-  </w:style>
-  <w:style w:customStyle="1" w:styleId="StringTok" w:type="character">
+      <w:color w:val="4070a0"/>
+    </w:rPr>
+  </w:style>
+  <w:style w:type="character" w:customStyle="1" w:styleId="StringTok">
     <w:name w:val="StringTok"/>
     <w:basedOn w:val="VerbatimChar"/>
     <w:rPr>
-      <w:color w:val="000000"/>
-    </w:rPr>
-  </w:style>
-  <w:style w:customStyle="1" w:styleId="VerbatimStringTok" w:type="character">
+      <w:color w:val="4070a0"/>
+    </w:rPr>
+  </w:style>
+  <w:style w:type="character" w:customStyle="1" w:styleId="VerbatimStringTok">
     <w:name w:val="VerbatimStringTok"/>
     <w:basedOn w:val="VerbatimChar"/>
     <w:rPr>
-      <w:color w:val="000000"/>
-    </w:rPr>
-  </w:style>
-  <w:style w:customStyle="1" w:styleId="SpecialStringTok" w:type="character">
+      <w:color w:val="4070a0"/>
+    </w:rPr>
+  </w:style>
+  <w:style w:type="character" w:customStyle="1" w:styleId="SpecialStringTok">
     <w:name w:val="SpecialStringTok"/>
     <w:basedOn w:val="VerbatimChar"/>
     <w:rPr>
-      <w:color w:val="000000"/>
-    </w:rPr>
-  </w:style>
-  <w:style w:customStyle="1" w:styleId="ImportTok" w:type="character">
+      <w:color w:val="bb6688"/>
+    </w:rPr>
+  </w:style>
+  <w:style w:type="character" w:customStyle="1" w:styleId="ImportTok">
     <w:name w:val="ImportTok"/>
     <w:basedOn w:val="VerbatimChar"/>
     <w:rPr>
       <w:b/>
-      <w:color w:val="000000"/>
-    </w:rPr>
-  </w:style>
-  <w:style w:customStyle="1" w:styleId="CommentTok" w:type="character">
+      <w:color w:val="008000"/>
+    </w:rPr>
+  </w:style>
+  <w:style w:type="character" w:customStyle="1" w:styleId="CommentTok">
     <w:name w:val="CommentTok"/>
     <w:basedOn w:val="VerbatimChar"/>
     <w:rPr>
       <w:i/>
-      <w:color w:val="000000"/>
-    </w:rPr>
-  </w:style>
-  <w:style w:customStyle="1" w:styleId="DocumentationTok" w:type="character">
+      <w:color w:val="60a0b0"/>
+    </w:rPr>
+  </w:style>
+  <w:style w:type="character" w:customStyle="1" w:styleId="DocumentationTok">
     <w:name w:val="DocumentationTok"/>
     <w:basedOn w:val="VerbatimChar"/>
     <w:rPr>
       <w:i/>
-      <w:color w:val="000000"/>
-    </w:rPr>
-  </w:style>
-  <w:style w:customStyle="1" w:styleId="AnnotationTok" w:type="character">
+      <w:color w:val="ba2121"/>
+    </w:rPr>
+  </w:style>
+  <w:style w:type="character" w:customStyle="1" w:styleId="AnnotationTok">
     <w:name w:val="AnnotationTok"/>
     <w:basedOn w:val="VerbatimChar"/>
     <w:rPr>
       <w:b/>
       <w:i/>
-      <w:color w:val="000000"/>
-    </w:rPr>
-  </w:style>
-  <w:style w:customStyle="1" w:styleId="CommentVarTok" w:type="character">
+      <w:color w:val="60a0b0"/>
+    </w:rPr>
+  </w:style>
+  <w:style w:type="character" w:customStyle="1" w:styleId="CommentVarTok">
     <w:name w:val="CommentVarTok"/>
     <w:basedOn w:val="VerbatimChar"/>
     <w:rPr>
       <w:b/>
       <w:i/>
-      <w:color w:val="000000"/>
-    </w:rPr>
-  </w:style>
-  <w:style w:customStyle="1" w:styleId="OtherTok" w:type="character">
+      <w:color w:val="60a0b0"/>
+    </w:rPr>
+  </w:style>
+  <w:style w:type="character" w:customStyle="1" w:styleId="OtherTok">
     <w:name w:val="OtherTok"/>
     <w:basedOn w:val="VerbatimChar"/>
     <w:rPr>
-      <w:color w:val="000000"/>
-    </w:rPr>
-  </w:style>
-  <w:style w:customStyle="1" w:styleId="FunctionTok" w:type="character">
+      <w:color w:val="007020"/>
+    </w:rPr>
+  </w:style>
+  <w:style w:type="character" w:customStyle="1" w:styleId="FunctionTok">
     <w:name w:val="FunctionTok"/>
     <w:basedOn w:val="VerbatimChar"/>
     <w:rPr>
-      <w:color w:val="000000"/>
-    </w:rPr>
-  </w:style>
-  <w:style w:customStyle="1" w:styleId="VariableTok" w:type="character">
+      <w:color w:val="06287e"/>
+    </w:rPr>
+  </w:style>
+  <w:style w:type="character" w:customStyle="1" w:styleId="VariableTok">
     <w:name w:val="VariableTok"/>
     <w:basedOn w:val="VerbatimChar"/>
     <w:rPr>
-      <w:color w:val="000000"/>
-    </w:rPr>
-  </w:style>
-  <w:style w:customStyle="1" w:styleId="ControlFlowTok" w:type="character">
+      <w:color w:val="19177c"/>
+    </w:rPr>
+  </w:style>
+  <w:style w:type="character" w:customStyle="1" w:styleId="ControlFlowTok">
     <w:name w:val="ControlFlowTok"/>
     <w:basedOn w:val="VerbatimChar"/>
     <w:rPr>
       <w:b/>
-      <w:color w:val="000000"/>
-    </w:rPr>
-  </w:style>
-  <w:style w:customStyle="1" w:styleId="OperatorTok" w:type="character">
+      <w:color w:val="007020"/>
+    </w:rPr>
+  </w:style>
+  <w:style w:type="character" w:customStyle="1" w:styleId="OperatorTok">
     <w:name w:val="OperatorTok"/>
     <w:basedOn w:val="VerbatimChar"/>
     <w:rPr>
-      <w:color w:val="000000"/>
-    </w:rPr>
-  </w:style>
-  <w:style w:customStyle="1" w:styleId="BuiltInTok" w:type="character">
+      <w:color w:val="666666"/>
+    </w:rPr>
+  </w:style>
+  <w:style w:type="character" w:customStyle="1" w:styleId="BuiltInTok">
     <w:name w:val="BuiltInTok"/>
     <w:basedOn w:val="VerbatimChar"/>
     <w:rPr>
-      <w:color w:val="000000"/>
-    </w:rPr>
-  </w:style>
-  <w:style w:customStyle="1" w:styleId="ExtensionTok" w:type="character">
+      <w:color w:val="008000"/>
+    </w:rPr>
+  </w:style>
+  <w:style w:type="character" w:customStyle="1" w:styleId="ExtensionTok">
     <w:name w:val="ExtensionTok"/>
     <w:basedOn w:val="VerbatimChar"/>
     <w:rPr/>
   </w:style>
-  <w:style w:customStyle="1" w:styleId="PreprocessorTok" w:type="character">
+  <w:style w:type="character" w:customStyle="1" w:styleId="PreprocessorTok">
     <w:name w:val="PreprocessorTok"/>
     <w:basedOn w:val="VerbatimChar"/>
     <w:rPr>
-      <w:color w:val="000000"/>
-    </w:rPr>
-  </w:style>
-  <w:style w:customStyle="1" w:styleId="AttributeTok" w:type="character">
+      <w:color w:val="bc7a00"/>
+    </w:rPr>
+  </w:style>
+  <w:style w:type="character" w:customStyle="1" w:styleId="AttributeTok">
     <w:name w:val="AttributeTok"/>
     <w:basedOn w:val="VerbatimChar"/>
     <w:rPr>
-      <w:color w:val="000000"/>
-    </w:rPr>
-  </w:style>
-  <w:style w:customStyle="1" w:styleId="RegionMarkerTok" w:type="character">
+      <w:color w:val="7d9029"/>
+    </w:rPr>
+  </w:style>
+  <w:style w:type="character" w:customStyle="1" w:styleId="RegionMarkerTok">
     <w:name w:val="RegionMarkerTok"/>
     <w:basedOn w:val="VerbatimChar"/>
     <w:rPr/>
   </w:style>
-  <w:style w:customStyle="1" w:styleId="InformationTok" w:type="character">
+  <w:style w:type="character" w:customStyle="1" w:styleId="InformationTok">
     <w:name w:val="InformationTok"/>
     <w:basedOn w:val="VerbatimChar"/>
     <w:rPr>
       <w:b/>
       <w:i/>
-      <w:color w:val="000000"/>
-    </w:rPr>
-  </w:style>
-  <w:style w:customStyle="1" w:styleId="WarningTok" w:type="character">
+      <w:color w:val="60a0b0"/>
+    </w:rPr>
+  </w:style>
+  <w:style w:type="character" w:customStyle="1" w:styleId="WarningTok">
     <w:name w:val="WarningTok"/>
     <w:basedOn w:val="VerbatimChar"/>
     <w:rPr>
       <w:b/>
       <w:i/>
-      <w:color w:val="000000"/>
-    </w:rPr>
-  </w:style>
-  <w:style w:customStyle="1" w:styleId="AlertTok" w:type="character">
+      <w:color w:val="60a0b0"/>
+    </w:rPr>
+  </w:style>
+  <w:style w:type="character" w:customStyle="1" w:styleId="AlertTok">
     <w:name w:val="AlertTok"/>
     <w:basedOn w:val="VerbatimChar"/>
     <w:rPr>
       <w:b/>
-      <w:color w:val="000000"/>
-    </w:rPr>
-  </w:style>
-  <w:style w:customStyle="1" w:styleId="ErrorTok" w:type="character">
+      <w:color w:val="ff0000"/>
+    </w:rPr>
+  </w:style>
+  <w:style w:type="character" w:customStyle="1" w:styleId="ErrorTok">
     <w:name w:val="ErrorTok"/>
     <w:basedOn w:val="VerbatimChar"/>
     <w:rPr>
       <w:b/>
-      <w:color w:val="000000"/>
-    </w:rPr>
-  </w:style>
-  <w:style w:customStyle="1" w:styleId="NormalTok" w:type="character">
+      <w:color w:val="ff0000"/>
+    </w:rPr>
+  </w:style>
+  <w:style w:type="character" w:customStyle="1" w:styleId="NormalTok">
     <w:name w:val="NormalTok"/>
     <w:basedOn w:val="VerbatimChar"/>
     <w:rPr/>

</xml_diff>

<commit_message>
Checklist: v0.6.0 tag/release cut
Co-Authored-By: Claude Opus 4.8 <noreply@anthropic.com>
</commit_message>
<xml_diff>
--- a/paper/SUBMISSION_CHECKLIST.docx
+++ b/paper/SUBMISSION_CHECKLIST.docx
@@ -175,7 +175,25 @@
         </w:numPr>
       </w:pPr>
       <w:r>
-        <w:t xml:space="preserve">OPEN: cut the v0.6.0 git tag/release (the paper references it); then the two submission clicks.</w:t>
+        <w:t xml:space="preserve">v0.6.0 tag and GitHub release cut (2026-09-09), published on main; the paper’s persistent</w:t>
+      </w:r>
+      <w:r>
+        <w:t xml:space="preserve"> </w:t>
+      </w:r>
+      <w:r>
+        <w:t xml:space="preserve">identifier https://github.com/odinzen/hephaestus-mqmqa-public/releases/tag/v0.6.0 resolves.</w:t>
+      </w:r>
+    </w:p>
+    <w:p>
+      <w:pPr>
+        <w:pStyle w:val="Compact"/>
+        <w:numPr>
+          <w:ilvl w:val="0"/>
+          <w:numId w:val="1001"/>
+        </w:numPr>
+      </w:pPr>
+      <w:r>
+        <w:t xml:space="preserve">OPEN: the two submission clicks (and refresh the desktop submission zip to v0.6.0).</w:t>
       </w:r>
     </w:p>
     <w:bookmarkEnd w:id="2323"/>

</xml_diff>